<commit_message>
Update invoice templates: raise price to 5000 yen and add auto-calc fields
Made-with: Cursor
</commit_message>
<xml_diff>
--- a/docs/invoice-templates/template_invoice.docx
+++ b/docs/invoice-templates/template_invoice.docx
@@ -366,7 +366,7 @@
                 <w:color w:val="1A1A1A"/>
                 <w:sz w:val="44"/>
               </w:rPr>
-              <w:t>￥0,000（税込・不課税）</w:t>
+              <w:t>￥5,000（消費税不課税）</w:t>
             </w:r>
           </w:p>
           <w:p>
@@ -477,7 +477,7 @@
                 <w:color w:val="6B7280"/>
                 <w:sz w:val="18"/>
               </w:rPr>
-              <w:t>単価</w:t>
+              <w:t>単価（円）</w:t>
             </w:r>
           </w:p>
         </w:tc>
@@ -504,7 +504,7 @@
                 <w:color w:val="6B7280"/>
                 <w:sz w:val="18"/>
               </w:rPr>
-              <w:t>金額</w:t>
+              <w:t>金額（円）</w:t>
             </w:r>
           </w:p>
         </w:tc>
@@ -583,7 +583,7 @@
                 <w:color w:val="1A1A1A"/>
                 <w:sz w:val="20"/>
               </w:rPr>
-              <w:t>￥3,850</w:t>
+              <w:t>5,000</w:t>
             </w:r>
           </w:p>
         </w:tc>
@@ -598,18 +598,31 @@
             </w:tcBorders>
           </w:tcPr>
           <w:p>
+            <w:bookmarkStart w:id="101" w:name="line_amt_1"/>
             <w:pPr>
               <w:spacing w:before="80" w:after="80"/>
               <w:jc w:val="right"/>
             </w:pPr>
+            <w:bookmarkEnd w:id="101"/>
+            <w:r>
+              <w:fldChar w:fldCharType="begin" w:dirty="true"/>
+            </w:r>
+            <w:r>
+              <w:instrText xml:space="preserve"> = B2 * C2 \# "#,##0" </w:instrText>
+            </w:r>
+            <w:r>
+              <w:fldChar w:fldCharType="separate"/>
+            </w:r>
             <w:r>
               <w:rPr>
-                <w:rFonts w:ascii="Noto Sans JP" w:hAnsi="Noto Sans JP" w:eastAsia="Noto Sans JP" w:cs="Noto Sans JP"/>
-                <w:b w:val="0"/>
+                <w:sz w:val="20"/>
+                <w:szCs w:val="20"/>
                 <w:color w:val="1A1A1A"/>
-                <w:sz w:val="20"/>
               </w:rPr>
-              <w:t>￥3,850</w:t>
+              <w:t>5,000</w:t>
+            </w:r>
+            <w:r>
+              <w:fldChar w:fldCharType="end"/>
             </w:r>
           </w:p>
         </w:tc>
@@ -665,13 +678,24 @@
               <w:t xml:space="preserve">小計　</w:t>
             </w:r>
             <w:r>
+              <w:fldChar w:fldCharType="begin" w:dirty="true"/>
+            </w:r>
+            <w:r>
+              <w:instrText xml:space="preserve"> = line_amt_1 \# "#,##0" </w:instrText>
+            </w:r>
+            <w:r>
+              <w:fldChar w:fldCharType="separate"/>
+            </w:r>
+            <w:r>
               <w:rPr>
-                <w:rFonts w:ascii="Noto Sans JP" w:hAnsi="Noto Sans JP" w:eastAsia="Noto Sans JP" w:cs="Noto Sans JP"/>
-                <w:b w:val="0"/>
+                <w:sz w:val="20"/>
+                <w:szCs w:val="20"/>
                 <w:color w:val="1A1A1A"/>
-                <w:sz w:val="20"/>
               </w:rPr>
-              <w:t>￥3,850</w:t>
+              <w:t>5,000</w:t>
+            </w:r>
+            <w:r>
+              <w:fldChar w:fldCharType="end"/>
             </w:r>
           </w:p>
         </w:tc>
@@ -714,13 +738,24 @@
               <w:t xml:space="preserve">合計　</w:t>
             </w:r>
             <w:r>
+              <w:fldChar w:fldCharType="begin" w:dirty="true"/>
+            </w:r>
+            <w:r>
+              <w:instrText xml:space="preserve"> = line_amt_1 \# "#,##0" </w:instrText>
+            </w:r>
+            <w:r>
+              <w:fldChar w:fldCharType="separate"/>
+            </w:r>
+            <w:r>
               <w:rPr>
-                <w:rFonts w:ascii="Noto Sans JP" w:hAnsi="Noto Sans JP" w:eastAsia="Noto Sans JP" w:cs="Noto Sans JP"/>
-                <w:b w:val="0"/>
+                <w:sz w:val="20"/>
+                <w:szCs w:val="20"/>
                 <w:color w:val="1A1A1A"/>
-                <w:sz w:val="20"/>
               </w:rPr>
-              <w:t>￥3,850</w:t>
+              <w:t>5,000</w:t>
+            </w:r>
+            <w:r>
+              <w:fldChar w:fldCharType="end"/>
             </w:r>
           </w:p>
         </w:tc>
@@ -763,13 +798,25 @@
               <w:t xml:space="preserve">ご請求金額　</w:t>
             </w:r>
             <w:r>
+              <w:fldChar w:fldCharType="begin" w:dirty="true"/>
+            </w:r>
+            <w:r>
+              <w:instrText xml:space="preserve"> = line_amt_1 \# "#,##0" </w:instrText>
+            </w:r>
+            <w:r>
+              <w:fldChar w:fldCharType="separate"/>
+            </w:r>
+            <w:r>
               <w:rPr>
-                <w:rFonts w:ascii="Noto Sans JP" w:hAnsi="Noto Sans JP" w:eastAsia="Noto Sans JP" w:cs="Noto Sans JP"/>
+                <w:sz w:val="26"/>
+                <w:szCs w:val="26"/>
                 <w:b/>
                 <w:color w:val="1A1A1A"/>
-                <w:sz w:val="26"/>
               </w:rPr>
-              <w:t>￥3,850</w:t>
+              <w:t>5,000</w:t>
+            </w:r>
+            <w:r>
+              <w:fldChar w:fldCharType="end"/>
             </w:r>
           </w:p>
         </w:tc>
@@ -787,7 +834,37 @@
           <w:color w:val="1A1A1A"/>
           <w:sz w:val="24"/>
         </w:rPr>
-        <w:t>銀行振込で ￥3,850 をお支払い</w:t>
+        <w:t xml:space="preserve">銀行振込で　</w:t>
+      </w:r>
+      <w:r>
+        <w:fldChar w:fldCharType="begin" w:dirty="true"/>
+      </w:r>
+      <w:r>
+        <w:instrText xml:space="preserve"> = line_amt_1 \# "#,##0" </w:instrText>
+      </w:r>
+      <w:r>
+        <w:fldChar w:fldCharType="separate"/>
+      </w:r>
+      <w:r>
+        <w:rPr>
+          <w:sz w:val="24"/>
+          <w:szCs w:val="24"/>
+          <w:b/>
+          <w:color w:val="1A1A1A"/>
+        </w:rPr>
+        <w:t>5,000</w:t>
+      </w:r>
+      <w:r>
+        <w:fldChar w:fldCharType="end"/>
+      </w:r>
+      <w:r>
+        <w:rPr>
+          <w:rFonts w:ascii="Noto Sans JP" w:hAnsi="Noto Sans JP" w:eastAsia="Noto Sans JP" w:cs="Noto Sans JP"/>
+          <w:b/>
+          <w:color w:val="1A1A1A"/>
+          <w:sz w:val="24"/>
+        </w:rPr>
+        <w:t xml:space="preserve"> 円　をお支払い</w:t>
       </w:r>
     </w:p>
     <w:p>

</xml_diff>